<commit_message>
Added RECSATbioinformatics pipeline, web app, and documentation
</commit_message>
<xml_diff>
--- a/FinalProjectProposal.docx
+++ b/FinalProjectProposal.docx
@@ -71,7 +71,15 @@
       </w:r>
       <w:bookmarkStart w:id="3" w:name="_Hlk226835825"/>
       <w:r>
-        <w:t xml:space="preserve">we would use a tool called SnapGene to </w:t>
+        <w:t xml:space="preserve">we would use a tool called </w:t>
+      </w:r>
+      <w:proofErr w:type="spellStart"/>
+      <w:r>
+        <w:t>SnapGene</w:t>
+      </w:r>
+      <w:proofErr w:type="spellEnd"/>
+      <w:r>
+        <w:t xml:space="preserve"> to </w:t>
       </w:r>
       <w:r>
         <w:t xml:space="preserve">visualize our DNA sequence and analyze restriction enzyme cut sites to help with the designing of primers. </w:t>
@@ -124,7 +132,7 @@
                     <pic:cNvPicPr/>
                   </pic:nvPicPr>
                   <pic:blipFill>
-                    <a:blip r:embed="rId6">
+                    <a:blip r:embed="rId7">
                       <a:extLst>
                         <a:ext uri="{28A0092B-C50C-407E-A947-70E740481C1C}">
                           <a14:useLocalDpi xmlns:a14="http://schemas.microsoft.com/office/drawing/2010/main" val="0"/>
@@ -172,7 +180,15 @@
         </w:r>
       </w:fldSimple>
       <w:r>
-        <w:t>: Screenshot taken from SnapGene showing the cut site for the restriction enzyme 'Bsu36I'.</w:t>
+        <w:t xml:space="preserve">: Screenshot taken from </w:t>
+      </w:r>
+      <w:proofErr w:type="spellStart"/>
+      <w:r>
+        <w:t>SnapGene</w:t>
+      </w:r>
+      <w:proofErr w:type="spellEnd"/>
+      <w:r>
+        <w:t xml:space="preserve"> showing the cut site for the restriction enzyme 'Bsu36I'.</w:t>
       </w:r>
     </w:p>
     <w:p/>
@@ -381,23 +397,32 @@
           <w:rFonts w:ascii="Courier New" w:hAnsi="Courier New" w:cs="Courier New"/>
         </w:rPr>
       </w:pPr>
+      <w:bookmarkStart w:id="5" w:name="_Hlk229063399"/>
+      <w:proofErr w:type="spellStart"/>
       <w:r>
         <w:rPr>
           <w:rFonts w:ascii="Courier New" w:hAnsi="Courier New" w:cs="Courier New"/>
         </w:rPr>
-        <w:t>EcoRI (G | AATTC)</w:t>
-      </w:r>
-    </w:p>
-    <w:p>
-      <w:pPr>
+        <w:t>EcoRI</w:t>
+      </w:r>
+      <w:proofErr w:type="spellEnd"/>
+      <w:r>
         <w:rPr>
           <w:rFonts w:ascii="Courier New" w:hAnsi="Courier New" w:cs="Courier New"/>
         </w:rPr>
-      </w:pPr>
-      <w:r>
+        <w:t xml:space="preserve"> (G | AATTC)</w:t>
+      </w:r>
+    </w:p>
+    <w:p>
+      <w:pPr>
         <w:rPr>
           <w:rFonts w:ascii="Courier New" w:hAnsi="Courier New" w:cs="Courier New"/>
         </w:rPr>
+      </w:pPr>
+      <w:r>
+        <w:rPr>
+          <w:rFonts w:ascii="Courier New" w:hAnsi="Courier New" w:cs="Courier New"/>
+        </w:rPr>
         <w:t>Cut Positions: 14</w:t>
       </w:r>
     </w:p>
@@ -414,6 +439,7 @@
         <w:t xml:space="preserve">Fragment Sizes: 14 bp, 16 bp </w:t>
       </w:r>
     </w:p>
+    <w:bookmarkEnd w:id="5"/>
     <w:p>
       <w:pPr>
         <w:rPr>
@@ -427,24 +453,32 @@
           <w:rFonts w:ascii="Courier New" w:hAnsi="Courier New" w:cs="Courier New"/>
         </w:rPr>
       </w:pPr>
-      <w:bookmarkStart w:id="5" w:name="_Hlk226835951"/>
+      <w:bookmarkStart w:id="6" w:name="_Hlk226835951"/>
+      <w:proofErr w:type="spellStart"/>
       <w:r>
         <w:rPr>
           <w:rFonts w:ascii="Courier New" w:hAnsi="Courier New" w:cs="Courier New"/>
         </w:rPr>
-        <w:t>BamHI (G | GATCC)</w:t>
-      </w:r>
-    </w:p>
-    <w:p>
-      <w:pPr>
+        <w:t>BamHI</w:t>
+      </w:r>
+      <w:proofErr w:type="spellEnd"/>
+      <w:r>
         <w:rPr>
           <w:rFonts w:ascii="Courier New" w:hAnsi="Courier New" w:cs="Courier New"/>
         </w:rPr>
-      </w:pPr>
-      <w:r>
+        <w:t xml:space="preserve"> (G | GATCC)</w:t>
+      </w:r>
+    </w:p>
+    <w:p>
+      <w:pPr>
         <w:rPr>
           <w:rFonts w:ascii="Courier New" w:hAnsi="Courier New" w:cs="Courier New"/>
         </w:rPr>
+      </w:pPr>
+      <w:r>
+        <w:rPr>
+          <w:rFonts w:ascii="Courier New" w:hAnsi="Courier New" w:cs="Courier New"/>
+        </w:rPr>
         <w:t>Cut Positions: 22</w:t>
       </w:r>
     </w:p>
@@ -461,10 +495,10 @@
         <w:t>Fragment Sizes: 22 bp, 8 bp</w:t>
       </w:r>
     </w:p>
-    <w:bookmarkEnd w:id="5"/>
+    <w:bookmarkEnd w:id="6"/>
     <w:p/>
     <w:p>
-      <w:bookmarkStart w:id="6" w:name="_Hlk226836045"/>
+      <w:bookmarkStart w:id="7" w:name="_Hlk226836045"/>
       <w:r>
         <w:rPr>
           <w:u w:val="single"/>
@@ -499,7 +533,15 @@
         <w:t xml:space="preserve"> the server-side processing. When the form is submitted, the CGI script will retrieve the input sequence, query a MySQL database containing restriction enzymes</w:t>
       </w:r>
       <w:r>
-        <w:t xml:space="preserve"> using the mysql.connector python module, and identify the matching recognition sites. </w:t>
+        <w:t xml:space="preserve"> using the </w:t>
+      </w:r>
+      <w:proofErr w:type="spellStart"/>
+      <w:r>
+        <w:t>mysql.connector</w:t>
+      </w:r>
+      <w:proofErr w:type="spellEnd"/>
+      <w:r>
+        <w:t xml:space="preserve"> python module, and identify the matching recognition sites. </w:t>
       </w:r>
       <w:r>
         <w:t>Parameterized</w:t>
@@ -517,10 +559,18 @@
         <w:t>200 of the most commonly used restriction enzymes. The restriction enzyme data will be obtained from publicly available source</w:t>
       </w:r>
       <w:r>
-        <w:t>s (such as NEB REBASE</w:t>
-      </w:r>
-      <w:r>
-        <w:t xml:space="preserve"> or New England Biolabs</w:t>
+        <w:t xml:space="preserve">s (such as </w:t>
+      </w:r>
+      <w:bookmarkStart w:id="8" w:name="_Hlk228971404"/>
+      <w:r>
+        <w:t>NEB REBASE</w:t>
+      </w:r>
+      <w:r>
+        <w:t xml:space="preserve"> </w:t>
+      </w:r>
+      <w:bookmarkEnd w:id="8"/>
+      <w:r>
+        <w:t>or New England Biolabs</w:t>
       </w:r>
       <w:r>
         <w:t>).</w:t>
@@ -590,10 +640,11 @@
       </w:r>
       <w:bookmarkEnd w:id="0"/>
       <w:bookmarkEnd w:id="1"/>
-      <w:bookmarkEnd w:id="6"/>
-    </w:p>
+      <w:bookmarkEnd w:id="7"/>
+    </w:p>
+    <w:p/>
     <w:sectPr>
-      <w:headerReference w:type="default" r:id="rId7"/>
+      <w:headerReference w:type="default" r:id="rId8"/>
       <w:pgSz w:w="12240" w:h="15840"/>
       <w:pgMar w:top="1440" w:right="1440" w:bottom="1440" w:left="1440" w:header="720" w:footer="720" w:gutter="0"/>
       <w:cols w:space="720"/>
@@ -660,6 +711,766 @@
     </w:r>
   </w:p>
 </w:hdr>
+</file>
+
+<file path=word/numbering.xml><?xml version="1.0" encoding="utf-8"?>
+<w:numbering xmlns:wpc="http://schemas.microsoft.com/office/word/2010/wordprocessingCanvas" xmlns:cx="http://schemas.microsoft.com/office/drawing/2014/chartex" xmlns:cx1="http://schemas.microsoft.com/office/drawing/2015/9/8/chartex" xmlns:cx2="http://schemas.microsoft.com/office/drawing/2015/10/21/chartex" xmlns:cx3="http://schemas.microsoft.com/office/drawing/2016/5/9/chartex" xmlns:cx4="http://schemas.microsoft.com/office/drawing/2016/5/10/chartex" xmlns:cx5="http://schemas.microsoft.com/office/drawing/2016/5/11/chartex" xmlns:cx6="http://schemas.microsoft.com/office/drawing/2016/5/12/chartex" xmlns:cx7="http://schemas.microsoft.com/office/drawing/2016/5/13/chartex" xmlns:cx8="http://schemas.microsoft.com/office/drawing/2016/5/14/chartex" xmlns:mc="http://schemas.openxmlformats.org/markup-compatibility/2006" xmlns:aink="http://schemas.microsoft.com/office/drawing/2016/ink" xmlns:am3d="http://schemas.microsoft.com/office/drawing/2017/model3d" xmlns:o="urn:schemas-microsoft-com:office:office" xmlns:oel="http://schemas.microsoft.com/office/2019/extlst" xmlns:r="http://schemas.openxmlformats.org/officeDocument/2006/relationships" xmlns:m="http://schemas.openxmlformats.org/officeDocument/2006/math" xmlns:v="urn:schemas-microsoft-com:vml" xmlns:wp14="http://schemas.microsoft.com/office/word/2010/wordprocessingDrawing" xmlns:wp="http://schemas.openxmlformats.org/drawingml/2006/wordprocessingDrawing" xmlns:w10="urn:schemas-microsoft-com:office:word" xmlns:w="http://schemas.openxmlformats.org/wordprocessingml/2006/main" xmlns:w14="http://schemas.microsoft.com/office/word/2010/wordml" xmlns:w15="http://schemas.microsoft.com/office/word/2012/wordml" xmlns:w16cex="http://schemas.microsoft.com/office/word/2018/wordml/cex" xmlns:w16cid="http://schemas.microsoft.com/office/word/2016/wordml/cid" xmlns:w16="http://schemas.microsoft.com/office/word/2018/wordml" xmlns:w16du="http://schemas.microsoft.com/office/word/2023/wordml/word16du" xmlns:w16sdtdh="http://schemas.microsoft.com/office/word/2020/wordml/sdtdatahash" xmlns:w16sdtfl="http://schemas.microsoft.com/office/word/2024/wordml/sdtformatlock" xmlns:w16se="http://schemas.microsoft.com/office/word/2015/wordml/symex" xmlns:wpg="http://schemas.microsoft.com/office/word/2010/wordprocessingGroup" xmlns:wpi="http://schemas.microsoft.com/office/word/2010/wordprocessingInk" xmlns:wne="http://schemas.microsoft.com/office/word/2006/wordml" xmlns:wps="http://schemas.microsoft.com/office/word/2010/wordprocessingShape" mc:Ignorable="w14 w15 w16se w16cid w16 w16cex w16sdtdh w16sdtfl w16du wp14">
+  <w:abstractNum w:abstractNumId="0" w15:restartNumberingAfterBreak="0">
+    <w:nsid w:val="10331832"/>
+    <w:multiLevelType w:val="multilevel"/>
+    <w:tmpl w:val="DE620F88"/>
+    <w:lvl w:ilvl="0">
+      <w:start w:val="1"/>
+      <w:numFmt w:val="bullet"/>
+      <w:lvlText w:val=""/>
+      <w:lvlJc w:val="left"/>
+      <w:pPr>
+        <w:tabs>
+          <w:tab w:val="num" w:pos="720"/>
+        </w:tabs>
+        <w:ind w:left="720" w:hanging="360"/>
+      </w:pPr>
+      <w:rPr>
+        <w:rFonts w:ascii="Symbol" w:hAnsi="Symbol" w:hint="default"/>
+        <w:sz w:val="20"/>
+      </w:rPr>
+    </w:lvl>
+    <w:lvl w:ilvl="1" w:tentative="1">
+      <w:start w:val="1"/>
+      <w:numFmt w:val="bullet"/>
+      <w:lvlText w:val="o"/>
+      <w:lvlJc w:val="left"/>
+      <w:pPr>
+        <w:tabs>
+          <w:tab w:val="num" w:pos="1440"/>
+        </w:tabs>
+        <w:ind w:left="1440" w:hanging="360"/>
+      </w:pPr>
+      <w:rPr>
+        <w:rFonts w:ascii="Courier New" w:hAnsi="Courier New" w:hint="default"/>
+        <w:sz w:val="20"/>
+      </w:rPr>
+    </w:lvl>
+    <w:lvl w:ilvl="2" w:tentative="1">
+      <w:start w:val="1"/>
+      <w:numFmt w:val="bullet"/>
+      <w:lvlText w:val=""/>
+      <w:lvlJc w:val="left"/>
+      <w:pPr>
+        <w:tabs>
+          <w:tab w:val="num" w:pos="2160"/>
+        </w:tabs>
+        <w:ind w:left="2160" w:hanging="360"/>
+      </w:pPr>
+      <w:rPr>
+        <w:rFonts w:ascii="Wingdings" w:hAnsi="Wingdings" w:hint="default"/>
+        <w:sz w:val="20"/>
+      </w:rPr>
+    </w:lvl>
+    <w:lvl w:ilvl="3" w:tentative="1">
+      <w:start w:val="1"/>
+      <w:numFmt w:val="bullet"/>
+      <w:lvlText w:val=""/>
+      <w:lvlJc w:val="left"/>
+      <w:pPr>
+        <w:tabs>
+          <w:tab w:val="num" w:pos="2880"/>
+        </w:tabs>
+        <w:ind w:left="2880" w:hanging="360"/>
+      </w:pPr>
+      <w:rPr>
+        <w:rFonts w:ascii="Wingdings" w:hAnsi="Wingdings" w:hint="default"/>
+        <w:sz w:val="20"/>
+      </w:rPr>
+    </w:lvl>
+    <w:lvl w:ilvl="4" w:tentative="1">
+      <w:start w:val="1"/>
+      <w:numFmt w:val="bullet"/>
+      <w:lvlText w:val=""/>
+      <w:lvlJc w:val="left"/>
+      <w:pPr>
+        <w:tabs>
+          <w:tab w:val="num" w:pos="3600"/>
+        </w:tabs>
+        <w:ind w:left="3600" w:hanging="360"/>
+      </w:pPr>
+      <w:rPr>
+        <w:rFonts w:ascii="Wingdings" w:hAnsi="Wingdings" w:hint="default"/>
+        <w:sz w:val="20"/>
+      </w:rPr>
+    </w:lvl>
+    <w:lvl w:ilvl="5" w:tentative="1">
+      <w:start w:val="1"/>
+      <w:numFmt w:val="bullet"/>
+      <w:lvlText w:val=""/>
+      <w:lvlJc w:val="left"/>
+      <w:pPr>
+        <w:tabs>
+          <w:tab w:val="num" w:pos="4320"/>
+        </w:tabs>
+        <w:ind w:left="4320" w:hanging="360"/>
+      </w:pPr>
+      <w:rPr>
+        <w:rFonts w:ascii="Wingdings" w:hAnsi="Wingdings" w:hint="default"/>
+        <w:sz w:val="20"/>
+      </w:rPr>
+    </w:lvl>
+    <w:lvl w:ilvl="6" w:tentative="1">
+      <w:start w:val="1"/>
+      <w:numFmt w:val="bullet"/>
+      <w:lvlText w:val=""/>
+      <w:lvlJc w:val="left"/>
+      <w:pPr>
+        <w:tabs>
+          <w:tab w:val="num" w:pos="5040"/>
+        </w:tabs>
+        <w:ind w:left="5040" w:hanging="360"/>
+      </w:pPr>
+      <w:rPr>
+        <w:rFonts w:ascii="Wingdings" w:hAnsi="Wingdings" w:hint="default"/>
+        <w:sz w:val="20"/>
+      </w:rPr>
+    </w:lvl>
+    <w:lvl w:ilvl="7" w:tentative="1">
+      <w:start w:val="1"/>
+      <w:numFmt w:val="bullet"/>
+      <w:lvlText w:val=""/>
+      <w:lvlJc w:val="left"/>
+      <w:pPr>
+        <w:tabs>
+          <w:tab w:val="num" w:pos="5760"/>
+        </w:tabs>
+        <w:ind w:left="5760" w:hanging="360"/>
+      </w:pPr>
+      <w:rPr>
+        <w:rFonts w:ascii="Wingdings" w:hAnsi="Wingdings" w:hint="default"/>
+        <w:sz w:val="20"/>
+      </w:rPr>
+    </w:lvl>
+    <w:lvl w:ilvl="8" w:tentative="1">
+      <w:start w:val="1"/>
+      <w:numFmt w:val="bullet"/>
+      <w:lvlText w:val=""/>
+      <w:lvlJc w:val="left"/>
+      <w:pPr>
+        <w:tabs>
+          <w:tab w:val="num" w:pos="6480"/>
+        </w:tabs>
+        <w:ind w:left="6480" w:hanging="360"/>
+      </w:pPr>
+      <w:rPr>
+        <w:rFonts w:ascii="Wingdings" w:hAnsi="Wingdings" w:hint="default"/>
+        <w:sz w:val="20"/>
+      </w:rPr>
+    </w:lvl>
+  </w:abstractNum>
+  <w:abstractNum w:abstractNumId="1" w15:restartNumberingAfterBreak="0">
+    <w:nsid w:val="4EEE4094"/>
+    <w:multiLevelType w:val="multilevel"/>
+    <w:tmpl w:val="451E1B2A"/>
+    <w:lvl w:ilvl="0">
+      <w:start w:val="1"/>
+      <w:numFmt w:val="bullet"/>
+      <w:lvlText w:val=""/>
+      <w:lvlJc w:val="left"/>
+      <w:pPr>
+        <w:tabs>
+          <w:tab w:val="num" w:pos="720"/>
+        </w:tabs>
+        <w:ind w:left="720" w:hanging="360"/>
+      </w:pPr>
+      <w:rPr>
+        <w:rFonts w:ascii="Symbol" w:hAnsi="Symbol" w:hint="default"/>
+        <w:sz w:val="20"/>
+      </w:rPr>
+    </w:lvl>
+    <w:lvl w:ilvl="1" w:tentative="1">
+      <w:start w:val="1"/>
+      <w:numFmt w:val="bullet"/>
+      <w:lvlText w:val="o"/>
+      <w:lvlJc w:val="left"/>
+      <w:pPr>
+        <w:tabs>
+          <w:tab w:val="num" w:pos="1440"/>
+        </w:tabs>
+        <w:ind w:left="1440" w:hanging="360"/>
+      </w:pPr>
+      <w:rPr>
+        <w:rFonts w:ascii="Courier New" w:hAnsi="Courier New" w:hint="default"/>
+        <w:sz w:val="20"/>
+      </w:rPr>
+    </w:lvl>
+    <w:lvl w:ilvl="2" w:tentative="1">
+      <w:start w:val="1"/>
+      <w:numFmt w:val="bullet"/>
+      <w:lvlText w:val=""/>
+      <w:lvlJc w:val="left"/>
+      <w:pPr>
+        <w:tabs>
+          <w:tab w:val="num" w:pos="2160"/>
+        </w:tabs>
+        <w:ind w:left="2160" w:hanging="360"/>
+      </w:pPr>
+      <w:rPr>
+        <w:rFonts w:ascii="Wingdings" w:hAnsi="Wingdings" w:hint="default"/>
+        <w:sz w:val="20"/>
+      </w:rPr>
+    </w:lvl>
+    <w:lvl w:ilvl="3" w:tentative="1">
+      <w:start w:val="1"/>
+      <w:numFmt w:val="bullet"/>
+      <w:lvlText w:val=""/>
+      <w:lvlJc w:val="left"/>
+      <w:pPr>
+        <w:tabs>
+          <w:tab w:val="num" w:pos="2880"/>
+        </w:tabs>
+        <w:ind w:left="2880" w:hanging="360"/>
+      </w:pPr>
+      <w:rPr>
+        <w:rFonts w:ascii="Wingdings" w:hAnsi="Wingdings" w:hint="default"/>
+        <w:sz w:val="20"/>
+      </w:rPr>
+    </w:lvl>
+    <w:lvl w:ilvl="4" w:tentative="1">
+      <w:start w:val="1"/>
+      <w:numFmt w:val="bullet"/>
+      <w:lvlText w:val=""/>
+      <w:lvlJc w:val="left"/>
+      <w:pPr>
+        <w:tabs>
+          <w:tab w:val="num" w:pos="3600"/>
+        </w:tabs>
+        <w:ind w:left="3600" w:hanging="360"/>
+      </w:pPr>
+      <w:rPr>
+        <w:rFonts w:ascii="Wingdings" w:hAnsi="Wingdings" w:hint="default"/>
+        <w:sz w:val="20"/>
+      </w:rPr>
+    </w:lvl>
+    <w:lvl w:ilvl="5" w:tentative="1">
+      <w:start w:val="1"/>
+      <w:numFmt w:val="bullet"/>
+      <w:lvlText w:val=""/>
+      <w:lvlJc w:val="left"/>
+      <w:pPr>
+        <w:tabs>
+          <w:tab w:val="num" w:pos="4320"/>
+        </w:tabs>
+        <w:ind w:left="4320" w:hanging="360"/>
+      </w:pPr>
+      <w:rPr>
+        <w:rFonts w:ascii="Wingdings" w:hAnsi="Wingdings" w:hint="default"/>
+        <w:sz w:val="20"/>
+      </w:rPr>
+    </w:lvl>
+    <w:lvl w:ilvl="6" w:tentative="1">
+      <w:start w:val="1"/>
+      <w:numFmt w:val="bullet"/>
+      <w:lvlText w:val=""/>
+      <w:lvlJc w:val="left"/>
+      <w:pPr>
+        <w:tabs>
+          <w:tab w:val="num" w:pos="5040"/>
+        </w:tabs>
+        <w:ind w:left="5040" w:hanging="360"/>
+      </w:pPr>
+      <w:rPr>
+        <w:rFonts w:ascii="Wingdings" w:hAnsi="Wingdings" w:hint="default"/>
+        <w:sz w:val="20"/>
+      </w:rPr>
+    </w:lvl>
+    <w:lvl w:ilvl="7" w:tentative="1">
+      <w:start w:val="1"/>
+      <w:numFmt w:val="bullet"/>
+      <w:lvlText w:val=""/>
+      <w:lvlJc w:val="left"/>
+      <w:pPr>
+        <w:tabs>
+          <w:tab w:val="num" w:pos="5760"/>
+        </w:tabs>
+        <w:ind w:left="5760" w:hanging="360"/>
+      </w:pPr>
+      <w:rPr>
+        <w:rFonts w:ascii="Wingdings" w:hAnsi="Wingdings" w:hint="default"/>
+        <w:sz w:val="20"/>
+      </w:rPr>
+    </w:lvl>
+    <w:lvl w:ilvl="8" w:tentative="1">
+      <w:start w:val="1"/>
+      <w:numFmt w:val="bullet"/>
+      <w:lvlText w:val=""/>
+      <w:lvlJc w:val="left"/>
+      <w:pPr>
+        <w:tabs>
+          <w:tab w:val="num" w:pos="6480"/>
+        </w:tabs>
+        <w:ind w:left="6480" w:hanging="360"/>
+      </w:pPr>
+      <w:rPr>
+        <w:rFonts w:ascii="Wingdings" w:hAnsi="Wingdings" w:hint="default"/>
+        <w:sz w:val="20"/>
+      </w:rPr>
+    </w:lvl>
+  </w:abstractNum>
+  <w:abstractNum w:abstractNumId="2" w15:restartNumberingAfterBreak="0">
+    <w:nsid w:val="5ACE54EE"/>
+    <w:multiLevelType w:val="multilevel"/>
+    <w:tmpl w:val="D8F6FF0E"/>
+    <w:lvl w:ilvl="0">
+      <w:start w:val="1"/>
+      <w:numFmt w:val="bullet"/>
+      <w:lvlText w:val=""/>
+      <w:lvlJc w:val="left"/>
+      <w:pPr>
+        <w:tabs>
+          <w:tab w:val="num" w:pos="720"/>
+        </w:tabs>
+        <w:ind w:left="720" w:hanging="360"/>
+      </w:pPr>
+      <w:rPr>
+        <w:rFonts w:ascii="Symbol" w:hAnsi="Symbol" w:hint="default"/>
+        <w:sz w:val="20"/>
+      </w:rPr>
+    </w:lvl>
+    <w:lvl w:ilvl="1" w:tentative="1">
+      <w:start w:val="1"/>
+      <w:numFmt w:val="bullet"/>
+      <w:lvlText w:val="o"/>
+      <w:lvlJc w:val="left"/>
+      <w:pPr>
+        <w:tabs>
+          <w:tab w:val="num" w:pos="1440"/>
+        </w:tabs>
+        <w:ind w:left="1440" w:hanging="360"/>
+      </w:pPr>
+      <w:rPr>
+        <w:rFonts w:ascii="Courier New" w:hAnsi="Courier New" w:hint="default"/>
+        <w:sz w:val="20"/>
+      </w:rPr>
+    </w:lvl>
+    <w:lvl w:ilvl="2" w:tentative="1">
+      <w:start w:val="1"/>
+      <w:numFmt w:val="bullet"/>
+      <w:lvlText w:val=""/>
+      <w:lvlJc w:val="left"/>
+      <w:pPr>
+        <w:tabs>
+          <w:tab w:val="num" w:pos="2160"/>
+        </w:tabs>
+        <w:ind w:left="2160" w:hanging="360"/>
+      </w:pPr>
+      <w:rPr>
+        <w:rFonts w:ascii="Wingdings" w:hAnsi="Wingdings" w:hint="default"/>
+        <w:sz w:val="20"/>
+      </w:rPr>
+    </w:lvl>
+    <w:lvl w:ilvl="3" w:tentative="1">
+      <w:start w:val="1"/>
+      <w:numFmt w:val="bullet"/>
+      <w:lvlText w:val=""/>
+      <w:lvlJc w:val="left"/>
+      <w:pPr>
+        <w:tabs>
+          <w:tab w:val="num" w:pos="2880"/>
+        </w:tabs>
+        <w:ind w:left="2880" w:hanging="360"/>
+      </w:pPr>
+      <w:rPr>
+        <w:rFonts w:ascii="Wingdings" w:hAnsi="Wingdings" w:hint="default"/>
+        <w:sz w:val="20"/>
+      </w:rPr>
+    </w:lvl>
+    <w:lvl w:ilvl="4" w:tentative="1">
+      <w:start w:val="1"/>
+      <w:numFmt w:val="bullet"/>
+      <w:lvlText w:val=""/>
+      <w:lvlJc w:val="left"/>
+      <w:pPr>
+        <w:tabs>
+          <w:tab w:val="num" w:pos="3600"/>
+        </w:tabs>
+        <w:ind w:left="3600" w:hanging="360"/>
+      </w:pPr>
+      <w:rPr>
+        <w:rFonts w:ascii="Wingdings" w:hAnsi="Wingdings" w:hint="default"/>
+        <w:sz w:val="20"/>
+      </w:rPr>
+    </w:lvl>
+    <w:lvl w:ilvl="5" w:tentative="1">
+      <w:start w:val="1"/>
+      <w:numFmt w:val="bullet"/>
+      <w:lvlText w:val=""/>
+      <w:lvlJc w:val="left"/>
+      <w:pPr>
+        <w:tabs>
+          <w:tab w:val="num" w:pos="4320"/>
+        </w:tabs>
+        <w:ind w:left="4320" w:hanging="360"/>
+      </w:pPr>
+      <w:rPr>
+        <w:rFonts w:ascii="Wingdings" w:hAnsi="Wingdings" w:hint="default"/>
+        <w:sz w:val="20"/>
+      </w:rPr>
+    </w:lvl>
+    <w:lvl w:ilvl="6" w:tentative="1">
+      <w:start w:val="1"/>
+      <w:numFmt w:val="bullet"/>
+      <w:lvlText w:val=""/>
+      <w:lvlJc w:val="left"/>
+      <w:pPr>
+        <w:tabs>
+          <w:tab w:val="num" w:pos="5040"/>
+        </w:tabs>
+        <w:ind w:left="5040" w:hanging="360"/>
+      </w:pPr>
+      <w:rPr>
+        <w:rFonts w:ascii="Wingdings" w:hAnsi="Wingdings" w:hint="default"/>
+        <w:sz w:val="20"/>
+      </w:rPr>
+    </w:lvl>
+    <w:lvl w:ilvl="7" w:tentative="1">
+      <w:start w:val="1"/>
+      <w:numFmt w:val="bullet"/>
+      <w:lvlText w:val=""/>
+      <w:lvlJc w:val="left"/>
+      <w:pPr>
+        <w:tabs>
+          <w:tab w:val="num" w:pos="5760"/>
+        </w:tabs>
+        <w:ind w:left="5760" w:hanging="360"/>
+      </w:pPr>
+      <w:rPr>
+        <w:rFonts w:ascii="Wingdings" w:hAnsi="Wingdings" w:hint="default"/>
+        <w:sz w:val="20"/>
+      </w:rPr>
+    </w:lvl>
+    <w:lvl w:ilvl="8" w:tentative="1">
+      <w:start w:val="1"/>
+      <w:numFmt w:val="bullet"/>
+      <w:lvlText w:val=""/>
+      <w:lvlJc w:val="left"/>
+      <w:pPr>
+        <w:tabs>
+          <w:tab w:val="num" w:pos="6480"/>
+        </w:tabs>
+        <w:ind w:left="6480" w:hanging="360"/>
+      </w:pPr>
+      <w:rPr>
+        <w:rFonts w:ascii="Wingdings" w:hAnsi="Wingdings" w:hint="default"/>
+        <w:sz w:val="20"/>
+      </w:rPr>
+    </w:lvl>
+  </w:abstractNum>
+  <w:abstractNum w:abstractNumId="3" w15:restartNumberingAfterBreak="0">
+    <w:nsid w:val="5F8C4AD3"/>
+    <w:multiLevelType w:val="multilevel"/>
+    <w:tmpl w:val="AD88C200"/>
+    <w:lvl w:ilvl="0">
+      <w:start w:val="1"/>
+      <w:numFmt w:val="bullet"/>
+      <w:lvlText w:val=""/>
+      <w:lvlJc w:val="left"/>
+      <w:pPr>
+        <w:tabs>
+          <w:tab w:val="num" w:pos="720"/>
+        </w:tabs>
+        <w:ind w:left="720" w:hanging="360"/>
+      </w:pPr>
+      <w:rPr>
+        <w:rFonts w:ascii="Symbol" w:hAnsi="Symbol" w:hint="default"/>
+        <w:sz w:val="20"/>
+      </w:rPr>
+    </w:lvl>
+    <w:lvl w:ilvl="1" w:tentative="1">
+      <w:start w:val="1"/>
+      <w:numFmt w:val="bullet"/>
+      <w:lvlText w:val="o"/>
+      <w:lvlJc w:val="left"/>
+      <w:pPr>
+        <w:tabs>
+          <w:tab w:val="num" w:pos="1440"/>
+        </w:tabs>
+        <w:ind w:left="1440" w:hanging="360"/>
+      </w:pPr>
+      <w:rPr>
+        <w:rFonts w:ascii="Courier New" w:hAnsi="Courier New" w:hint="default"/>
+        <w:sz w:val="20"/>
+      </w:rPr>
+    </w:lvl>
+    <w:lvl w:ilvl="2" w:tentative="1">
+      <w:start w:val="1"/>
+      <w:numFmt w:val="bullet"/>
+      <w:lvlText w:val=""/>
+      <w:lvlJc w:val="left"/>
+      <w:pPr>
+        <w:tabs>
+          <w:tab w:val="num" w:pos="2160"/>
+        </w:tabs>
+        <w:ind w:left="2160" w:hanging="360"/>
+      </w:pPr>
+      <w:rPr>
+        <w:rFonts w:ascii="Wingdings" w:hAnsi="Wingdings" w:hint="default"/>
+        <w:sz w:val="20"/>
+      </w:rPr>
+    </w:lvl>
+    <w:lvl w:ilvl="3" w:tentative="1">
+      <w:start w:val="1"/>
+      <w:numFmt w:val="bullet"/>
+      <w:lvlText w:val=""/>
+      <w:lvlJc w:val="left"/>
+      <w:pPr>
+        <w:tabs>
+          <w:tab w:val="num" w:pos="2880"/>
+        </w:tabs>
+        <w:ind w:left="2880" w:hanging="360"/>
+      </w:pPr>
+      <w:rPr>
+        <w:rFonts w:ascii="Wingdings" w:hAnsi="Wingdings" w:hint="default"/>
+        <w:sz w:val="20"/>
+      </w:rPr>
+    </w:lvl>
+    <w:lvl w:ilvl="4" w:tentative="1">
+      <w:start w:val="1"/>
+      <w:numFmt w:val="bullet"/>
+      <w:lvlText w:val=""/>
+      <w:lvlJc w:val="left"/>
+      <w:pPr>
+        <w:tabs>
+          <w:tab w:val="num" w:pos="3600"/>
+        </w:tabs>
+        <w:ind w:left="3600" w:hanging="360"/>
+      </w:pPr>
+      <w:rPr>
+        <w:rFonts w:ascii="Wingdings" w:hAnsi="Wingdings" w:hint="default"/>
+        <w:sz w:val="20"/>
+      </w:rPr>
+    </w:lvl>
+    <w:lvl w:ilvl="5" w:tentative="1">
+      <w:start w:val="1"/>
+      <w:numFmt w:val="bullet"/>
+      <w:lvlText w:val=""/>
+      <w:lvlJc w:val="left"/>
+      <w:pPr>
+        <w:tabs>
+          <w:tab w:val="num" w:pos="4320"/>
+        </w:tabs>
+        <w:ind w:left="4320" w:hanging="360"/>
+      </w:pPr>
+      <w:rPr>
+        <w:rFonts w:ascii="Wingdings" w:hAnsi="Wingdings" w:hint="default"/>
+        <w:sz w:val="20"/>
+      </w:rPr>
+    </w:lvl>
+    <w:lvl w:ilvl="6" w:tentative="1">
+      <w:start w:val="1"/>
+      <w:numFmt w:val="bullet"/>
+      <w:lvlText w:val=""/>
+      <w:lvlJc w:val="left"/>
+      <w:pPr>
+        <w:tabs>
+          <w:tab w:val="num" w:pos="5040"/>
+        </w:tabs>
+        <w:ind w:left="5040" w:hanging="360"/>
+      </w:pPr>
+      <w:rPr>
+        <w:rFonts w:ascii="Wingdings" w:hAnsi="Wingdings" w:hint="default"/>
+        <w:sz w:val="20"/>
+      </w:rPr>
+    </w:lvl>
+    <w:lvl w:ilvl="7" w:tentative="1">
+      <w:start w:val="1"/>
+      <w:numFmt w:val="bullet"/>
+      <w:lvlText w:val=""/>
+      <w:lvlJc w:val="left"/>
+      <w:pPr>
+        <w:tabs>
+          <w:tab w:val="num" w:pos="5760"/>
+        </w:tabs>
+        <w:ind w:left="5760" w:hanging="360"/>
+      </w:pPr>
+      <w:rPr>
+        <w:rFonts w:ascii="Wingdings" w:hAnsi="Wingdings" w:hint="default"/>
+        <w:sz w:val="20"/>
+      </w:rPr>
+    </w:lvl>
+    <w:lvl w:ilvl="8" w:tentative="1">
+      <w:start w:val="1"/>
+      <w:numFmt w:val="bullet"/>
+      <w:lvlText w:val=""/>
+      <w:lvlJc w:val="left"/>
+      <w:pPr>
+        <w:tabs>
+          <w:tab w:val="num" w:pos="6480"/>
+        </w:tabs>
+        <w:ind w:left="6480" w:hanging="360"/>
+      </w:pPr>
+      <w:rPr>
+        <w:rFonts w:ascii="Wingdings" w:hAnsi="Wingdings" w:hint="default"/>
+        <w:sz w:val="20"/>
+      </w:rPr>
+    </w:lvl>
+  </w:abstractNum>
+  <w:abstractNum w:abstractNumId="4" w15:restartNumberingAfterBreak="0">
+    <w:nsid w:val="702338DF"/>
+    <w:multiLevelType w:val="multilevel"/>
+    <w:tmpl w:val="7AFC72C2"/>
+    <w:lvl w:ilvl="0">
+      <w:start w:val="1"/>
+      <w:numFmt w:val="bullet"/>
+      <w:lvlText w:val=""/>
+      <w:lvlJc w:val="left"/>
+      <w:pPr>
+        <w:tabs>
+          <w:tab w:val="num" w:pos="720"/>
+        </w:tabs>
+        <w:ind w:left="720" w:hanging="360"/>
+      </w:pPr>
+      <w:rPr>
+        <w:rFonts w:ascii="Symbol" w:hAnsi="Symbol" w:hint="default"/>
+        <w:sz w:val="20"/>
+      </w:rPr>
+    </w:lvl>
+    <w:lvl w:ilvl="1">
+      <w:numFmt w:val="bullet"/>
+      <w:lvlText w:val="-"/>
+      <w:lvlJc w:val="left"/>
+      <w:pPr>
+        <w:ind w:left="1440" w:hanging="360"/>
+      </w:pPr>
+      <w:rPr>
+        <w:rFonts w:ascii="Times New Roman" w:eastAsiaTheme="minorHAnsi" w:hAnsi="Times New Roman" w:cs="Times New Roman" w:hint="default"/>
+      </w:rPr>
+    </w:lvl>
+    <w:lvl w:ilvl="2">
+      <w:start w:val="1"/>
+      <w:numFmt w:val="bullet"/>
+      <w:lvlText w:val=""/>
+      <w:lvlJc w:val="left"/>
+      <w:pPr>
+        <w:tabs>
+          <w:tab w:val="num" w:pos="2160"/>
+        </w:tabs>
+        <w:ind w:left="2160" w:hanging="360"/>
+      </w:pPr>
+      <w:rPr>
+        <w:rFonts w:ascii="Wingdings" w:hAnsi="Wingdings" w:hint="default"/>
+        <w:sz w:val="20"/>
+      </w:rPr>
+    </w:lvl>
+    <w:lvl w:ilvl="3" w:tentative="1">
+      <w:start w:val="1"/>
+      <w:numFmt w:val="bullet"/>
+      <w:lvlText w:val=""/>
+      <w:lvlJc w:val="left"/>
+      <w:pPr>
+        <w:tabs>
+          <w:tab w:val="num" w:pos="2880"/>
+        </w:tabs>
+        <w:ind w:left="2880" w:hanging="360"/>
+      </w:pPr>
+      <w:rPr>
+        <w:rFonts w:ascii="Wingdings" w:hAnsi="Wingdings" w:hint="default"/>
+        <w:sz w:val="20"/>
+      </w:rPr>
+    </w:lvl>
+    <w:lvl w:ilvl="4" w:tentative="1">
+      <w:start w:val="1"/>
+      <w:numFmt w:val="bullet"/>
+      <w:lvlText w:val=""/>
+      <w:lvlJc w:val="left"/>
+      <w:pPr>
+        <w:tabs>
+          <w:tab w:val="num" w:pos="3600"/>
+        </w:tabs>
+        <w:ind w:left="3600" w:hanging="360"/>
+      </w:pPr>
+      <w:rPr>
+        <w:rFonts w:ascii="Wingdings" w:hAnsi="Wingdings" w:hint="default"/>
+        <w:sz w:val="20"/>
+      </w:rPr>
+    </w:lvl>
+    <w:lvl w:ilvl="5" w:tentative="1">
+      <w:start w:val="1"/>
+      <w:numFmt w:val="bullet"/>
+      <w:lvlText w:val=""/>
+      <w:lvlJc w:val="left"/>
+      <w:pPr>
+        <w:tabs>
+          <w:tab w:val="num" w:pos="4320"/>
+        </w:tabs>
+        <w:ind w:left="4320" w:hanging="360"/>
+      </w:pPr>
+      <w:rPr>
+        <w:rFonts w:ascii="Wingdings" w:hAnsi="Wingdings" w:hint="default"/>
+        <w:sz w:val="20"/>
+      </w:rPr>
+    </w:lvl>
+    <w:lvl w:ilvl="6" w:tentative="1">
+      <w:start w:val="1"/>
+      <w:numFmt w:val="bullet"/>
+      <w:lvlText w:val=""/>
+      <w:lvlJc w:val="left"/>
+      <w:pPr>
+        <w:tabs>
+          <w:tab w:val="num" w:pos="5040"/>
+        </w:tabs>
+        <w:ind w:left="5040" w:hanging="360"/>
+      </w:pPr>
+      <w:rPr>
+        <w:rFonts w:ascii="Wingdings" w:hAnsi="Wingdings" w:hint="default"/>
+        <w:sz w:val="20"/>
+      </w:rPr>
+    </w:lvl>
+    <w:lvl w:ilvl="7" w:tentative="1">
+      <w:start w:val="1"/>
+      <w:numFmt w:val="bullet"/>
+      <w:lvlText w:val=""/>
+      <w:lvlJc w:val="left"/>
+      <w:pPr>
+        <w:tabs>
+          <w:tab w:val="num" w:pos="5760"/>
+        </w:tabs>
+        <w:ind w:left="5760" w:hanging="360"/>
+      </w:pPr>
+      <w:rPr>
+        <w:rFonts w:ascii="Wingdings" w:hAnsi="Wingdings" w:hint="default"/>
+        <w:sz w:val="20"/>
+      </w:rPr>
+    </w:lvl>
+    <w:lvl w:ilvl="8" w:tentative="1">
+      <w:start w:val="1"/>
+      <w:numFmt w:val="bullet"/>
+      <w:lvlText w:val=""/>
+      <w:lvlJc w:val="left"/>
+      <w:pPr>
+        <w:tabs>
+          <w:tab w:val="num" w:pos="6480"/>
+        </w:tabs>
+        <w:ind w:left="6480" w:hanging="360"/>
+      </w:pPr>
+      <w:rPr>
+        <w:rFonts w:ascii="Wingdings" w:hAnsi="Wingdings" w:hint="default"/>
+        <w:sz w:val="20"/>
+      </w:rPr>
+    </w:lvl>
+  </w:abstractNum>
+  <w:num w:numId="1" w16cid:durableId="1228763202">
+    <w:abstractNumId w:val="4"/>
+  </w:num>
+  <w:num w:numId="2" w16cid:durableId="545414199">
+    <w:abstractNumId w:val="2"/>
+  </w:num>
+  <w:num w:numId="3" w16cid:durableId="443380166">
+    <w:abstractNumId w:val="3"/>
+  </w:num>
+  <w:num w:numId="4" w16cid:durableId="721489715">
+    <w:abstractNumId w:val="0"/>
+  </w:num>
+  <w:num w:numId="5" w16cid:durableId="762841480">
+    <w:abstractNumId w:val="1"/>
+  </w:num>
+</w:numbering>
 </file>
 
 <file path=word/styles.xml><?xml version="1.0" encoding="utf-8"?>
@@ -1086,7 +1897,6 @@
     <w:next w:val="Normal"/>
     <w:link w:val="Heading2Char"/>
     <w:uiPriority w:val="9"/>
-    <w:semiHidden/>
     <w:unhideWhenUsed/>
     <w:qFormat/>
     <w:rsid w:val="00DD5806"/>
@@ -1301,7 +2111,6 @@
     <w:basedOn w:val="DefaultParagraphFont"/>
     <w:link w:val="Heading2"/>
     <w:uiPriority w:val="9"/>
-    <w:semiHidden/>
     <w:rsid w:val="00DD5806"/>
     <w:rPr>
       <w:rFonts w:asciiTheme="majorHAnsi" w:eastAsiaTheme="majorEastAsia" w:hAnsiTheme="majorHAnsi" w:cstheme="majorBidi"/>
@@ -1634,6 +2443,121 @@
       <w:sz w:val="18"/>
       <w:szCs w:val="18"/>
     </w:rPr>
+  </w:style>
+  <w:style w:type="paragraph" w:styleId="HTMLPreformatted">
+    <w:name w:val="HTML Preformatted"/>
+    <w:basedOn w:val="Normal"/>
+    <w:link w:val="HTMLPreformattedChar"/>
+    <w:uiPriority w:val="99"/>
+    <w:semiHidden/>
+    <w:unhideWhenUsed/>
+    <w:rsid w:val="00CC1874"/>
+    <w:pPr>
+      <w:tabs>
+        <w:tab w:val="left" w:pos="916"/>
+        <w:tab w:val="left" w:pos="1832"/>
+        <w:tab w:val="left" w:pos="2748"/>
+        <w:tab w:val="left" w:pos="3664"/>
+        <w:tab w:val="left" w:pos="4580"/>
+        <w:tab w:val="left" w:pos="5496"/>
+        <w:tab w:val="left" w:pos="6412"/>
+        <w:tab w:val="left" w:pos="7328"/>
+        <w:tab w:val="left" w:pos="8244"/>
+        <w:tab w:val="left" w:pos="9160"/>
+        <w:tab w:val="left" w:pos="10076"/>
+        <w:tab w:val="left" w:pos="10992"/>
+        <w:tab w:val="left" w:pos="11908"/>
+        <w:tab w:val="left" w:pos="12824"/>
+        <w:tab w:val="left" w:pos="13740"/>
+        <w:tab w:val="left" w:pos="14656"/>
+      </w:tabs>
+    </w:pPr>
+    <w:rPr>
+      <w:rFonts w:ascii="Courier New" w:eastAsia="Times New Roman" w:hAnsi="Courier New" w:cs="Courier New"/>
+      <w:kern w:val="0"/>
+      <w:sz w:val="20"/>
+      <w:szCs w:val="20"/>
+      <w14:ligatures w14:val="none"/>
+    </w:rPr>
+  </w:style>
+  <w:style w:type="character" w:customStyle="1" w:styleId="HTMLPreformattedChar">
+    <w:name w:val="HTML Preformatted Char"/>
+    <w:basedOn w:val="DefaultParagraphFont"/>
+    <w:link w:val="HTMLPreformatted"/>
+    <w:uiPriority w:val="99"/>
+    <w:semiHidden/>
+    <w:rsid w:val="00CC1874"/>
+    <w:rPr>
+      <w:rFonts w:ascii="Courier New" w:eastAsia="Times New Roman" w:hAnsi="Courier New" w:cs="Courier New"/>
+      <w:kern w:val="0"/>
+      <w:sz w:val="20"/>
+      <w:szCs w:val="20"/>
+      <w14:ligatures w14:val="none"/>
+    </w:rPr>
+  </w:style>
+  <w:style w:type="character" w:styleId="HTMLCode">
+    <w:name w:val="HTML Code"/>
+    <w:basedOn w:val="DefaultParagraphFont"/>
+    <w:uiPriority w:val="99"/>
+    <w:semiHidden/>
+    <w:unhideWhenUsed/>
+    <w:rsid w:val="00CC1874"/>
+    <w:rPr>
+      <w:rFonts w:ascii="Courier New" w:eastAsia="Times New Roman" w:hAnsi="Courier New" w:cs="Courier New"/>
+      <w:sz w:val="20"/>
+      <w:szCs w:val="20"/>
+    </w:rPr>
+  </w:style>
+  <w:style w:type="character" w:customStyle="1" w:styleId="11">
+    <w:name w:val="ͼ11"/>
+    <w:basedOn w:val="DefaultParagraphFont"/>
+    <w:rsid w:val="00CC1874"/>
+  </w:style>
+  <w:style w:type="character" w:customStyle="1" w:styleId="v">
+    <w:name w:val="ͼv"/>
+    <w:basedOn w:val="DefaultParagraphFont"/>
+    <w:rsid w:val="00CC1874"/>
+  </w:style>
+  <w:style w:type="character" w:customStyle="1" w:styleId="z">
+    <w:name w:val="ͼz"/>
+    <w:basedOn w:val="DefaultParagraphFont"/>
+    <w:rsid w:val="00CC1874"/>
+  </w:style>
+  <w:style w:type="paragraph" w:styleId="NormalWeb">
+    <w:name w:val="Normal (Web)"/>
+    <w:basedOn w:val="Normal"/>
+    <w:uiPriority w:val="99"/>
+    <w:semiHidden/>
+    <w:unhideWhenUsed/>
+    <w:rsid w:val="00CC1874"/>
+    <w:pPr>
+      <w:spacing w:before="100" w:beforeAutospacing="1" w:after="100" w:afterAutospacing="1"/>
+    </w:pPr>
+    <w:rPr>
+      <w:rFonts w:eastAsia="Times New Roman"/>
+      <w:kern w:val="0"/>
+      <w14:ligatures w14:val="none"/>
+    </w:rPr>
+  </w:style>
+  <w:style w:type="character" w:customStyle="1" w:styleId="13">
+    <w:name w:val="ͼ13"/>
+    <w:basedOn w:val="DefaultParagraphFont"/>
+    <w:rsid w:val="00CC1874"/>
+  </w:style>
+  <w:style w:type="character" w:customStyle="1" w:styleId="12">
+    <w:name w:val="ͼ12"/>
+    <w:basedOn w:val="DefaultParagraphFont"/>
+    <w:rsid w:val="00CC1874"/>
+  </w:style>
+  <w:style w:type="character" w:customStyle="1" w:styleId="y">
+    <w:name w:val="ͼy"/>
+    <w:basedOn w:val="DefaultParagraphFont"/>
+    <w:rsid w:val="00361731"/>
+  </w:style>
+  <w:style w:type="character" w:customStyle="1" w:styleId="10">
+    <w:name w:val="ͼ10"/>
+    <w:basedOn w:val="DefaultParagraphFont"/>
+    <w:rsid w:val="003A27F8"/>
   </w:style>
 </w:styles>
 </file>

</xml_diff>